<commit_message>
Add report photos, editable report number, PDF export and e-mail to OSP
Reports get confirmation and extra photos (phone camera, shrunk in the
browser and re-encoded with sharp). Reports and Meldunki export to PDF
by converting the filled Word templates with LibreOffice; the report PDF
gets the photos appended as extra pages so it goes out as one file. A
"send to OSP e-mail" button mails the PDF via SMTP. The report number is
editable (suggested next free number, rename on the detail page).

Also: Meldunek template cell mapping fixed after checking a rendered
PDF (size row, two commanders), tab-aligned equipment columns in the
report, password change and account creation, production-safe seed,
and a step-by-step OVH deployment guide.

Co-Authored-By: Claude Sonnet 5.5 <noreply@anthropic.com>
</commit_message>
<xml_diff>
--- a/src/lib/docx-templates/meldunek-template.docx
+++ b/src/lib/docx-templates/meldunek-template.docx
@@ -5215,7 +5215,7 @@
               </w:rPr>
             </w:pPr>
             <w:r>
-              <w:t xml:space="preserve">{straty}</w:t>
+              <w:t xml:space="preserve">{powierzchnia}</w:t>
             </w:r>
           </w:p>
         </w:tc>
@@ -5241,151 +5241,154 @@
               </w:rPr>
             </w:pPr>
             <w:r>
+              <w:t xml:space="preserve">{kubatura}</w:t>
+            </w:r>
+          </w:p>
+        </w:tc>
+        <w:tc>
+          <w:tcPr>
+            <w:tcW w:w="1140" w:type="dxa"/>
+            <w:tcBorders>
+              <w:top w:val="single" w:sz="4" w:space="0" w:color="000000"/>
+              <w:left w:val="single" w:sz="8" w:space="0" w:color="000000"/>
+              <w:bottom w:val="single" w:sz="8" w:space="0" w:color="000000"/>
+              <w:right w:val="single" w:sz="4" w:space="0" w:color="000000"/>
+            </w:tcBorders>
+            <w:vAlign w:val="center"/>
+          </w:tcPr>
+          <w:p>
+            <w:pPr>
+              <w:spacing w:after="0" w:line="240" w:lineRule="auto"/>
+              <w:jc w:val="center"/>
+              <w:rPr>
+                <w:sz w:val="20"/>
+                <w:szCs w:val="20"/>
+              </w:rPr>
+            </w:pPr>
+            <w:r>
+              <w:t xml:space="preserve">{dlugosc}</w:t>
+            </w:r>
+          </w:p>
+        </w:tc>
+        <w:tc>
+          <w:tcPr>
+            <w:tcW w:w="855" w:type="dxa"/>
+            <w:tcBorders>
+              <w:top w:val="single" w:sz="4" w:space="0" w:color="000000"/>
+              <w:left w:val="single" w:sz="4" w:space="0" w:color="000000"/>
+              <w:bottom w:val="single" w:sz="8" w:space="0" w:color="000000"/>
+              <w:right w:val="single" w:sz="4" w:space="0" w:color="000000"/>
+            </w:tcBorders>
+            <w:vAlign w:val="center"/>
+          </w:tcPr>
+          <w:p>
+            <w:pPr>
+              <w:spacing w:after="0" w:line="240" w:lineRule="auto"/>
+              <w:jc w:val="center"/>
+              <w:rPr>
+                <w:sz w:val="20"/>
+                <w:szCs w:val="20"/>
+              </w:rPr>
+            </w:pPr>
+            <w:r>
+              <w:t xml:space="preserve">{szerokosc}</w:t>
+            </w:r>
+          </w:p>
+        </w:tc>
+        <w:tc>
+          <w:tcPr>
+            <w:tcW w:w="630" w:type="dxa"/>
+            <w:tcBorders>
+              <w:top w:val="single" w:sz="4" w:space="0" w:color="000000"/>
+              <w:left w:val="single" w:sz="4" w:space="0" w:color="000000"/>
+              <w:bottom w:val="single" w:sz="8" w:space="0" w:color="000000"/>
+              <w:right w:val="single" w:sz="8" w:space="0" w:color="000000"/>
+            </w:tcBorders>
+            <w:vAlign w:val="center"/>
+          </w:tcPr>
+          <w:p>
+            <w:pPr>
+              <w:spacing w:after="0" w:line="240" w:lineRule="auto"/>
+              <w:jc w:val="center"/>
+              <w:rPr>
+                <w:sz w:val="20"/>
+                <w:szCs w:val="20"/>
+              </w:rPr>
+            </w:pPr>
+            <w:r>
+              <w:t xml:space="preserve">{wysokosc}</w:t>
+            </w:r>
+          </w:p>
+        </w:tc>
+        <w:tc>
+          <w:tcPr>
+            <w:tcW w:w="1215" w:type="dxa"/>
+            <w:tcBorders>
+              <w:top w:val="single" w:sz="4" w:space="0" w:color="000000"/>
+              <w:left w:val="single" w:sz="8" w:space="0" w:color="000000"/>
+              <w:bottom w:val="single" w:sz="8" w:space="0" w:color="000000"/>
+              <w:right w:val="single" w:sz="4" w:space="0" w:color="000000"/>
+            </w:tcBorders>
+            <w:vAlign w:val="bottom"/>
+          </w:tcPr>
+          <w:p>
+            <w:pPr>
+              <w:spacing w:after="0" w:line="240" w:lineRule="auto"/>
+              <w:rPr>
+                <w:sz w:val="20"/>
+                <w:szCs w:val="20"/>
+              </w:rPr>
+            </w:pPr>
+            <w:r>
+              <w:t xml:space="preserve">{straty}</w:t>
+            </w:r>
+          </w:p>
+        </w:tc>
+        <w:tc>
+          <w:tcPr>
+            <w:tcW w:w="915" w:type="dxa"/>
+            <w:tcBorders>
+              <w:top w:val="single" w:sz="4" w:space="0" w:color="000000"/>
+              <w:left w:val="single" w:sz="4" w:space="0" w:color="000000"/>
+              <w:bottom w:val="single" w:sz="8" w:space="0" w:color="000000"/>
+              <w:right w:val="single" w:sz="8" w:space="0" w:color="000000"/>
+            </w:tcBorders>
+            <w:vAlign w:val="bottom"/>
+          </w:tcPr>
+          <w:p>
+            <w:pPr>
+              <w:spacing w:after="0" w:line="240" w:lineRule="auto"/>
+              <w:rPr>
+                <w:sz w:val="20"/>
+                <w:szCs w:val="20"/>
+              </w:rPr>
+            </w:pPr>
+            <w:r>
+              <w:t xml:space="preserve">{stratyBudynki}</w:t>
+            </w:r>
+          </w:p>
+        </w:tc>
+        <w:tc>
+          <w:tcPr>
+            <w:tcW w:w="1350" w:type="dxa"/>
+            <w:tcBorders>
+              <w:top w:val="single" w:sz="4" w:space="0" w:color="000000"/>
+              <w:left w:val="single" w:sz="8" w:space="0" w:color="000000"/>
+              <w:bottom w:val="single" w:sz="8" w:space="0" w:color="000000"/>
+              <w:right w:val="single" w:sz="8" w:space="0" w:color="000000"/>
+            </w:tcBorders>
+            <w:vAlign w:val="bottom"/>
+          </w:tcPr>
+          <w:p>
+            <w:pPr>
+              <w:spacing w:after="0" w:line="240" w:lineRule="auto"/>
+              <w:rPr>
+                <w:sz w:val="20"/>
+                <w:szCs w:val="20"/>
+              </w:rPr>
+            </w:pPr>
+            <w:r>
               <w:t xml:space="preserve">{uratowano}</w:t>
-            </w:r>
-          </w:p>
-        </w:tc>
-        <w:tc>
-          <w:tcPr>
-            <w:tcW w:w="1140" w:type="dxa"/>
-            <w:tcBorders>
-              <w:top w:val="single" w:sz="4" w:space="0" w:color="000000"/>
-              <w:left w:val="single" w:sz="8" w:space="0" w:color="000000"/>
-              <w:bottom w:val="single" w:sz="8" w:space="0" w:color="000000"/>
-              <w:right w:val="single" w:sz="4" w:space="0" w:color="000000"/>
-            </w:tcBorders>
-            <w:vAlign w:val="center"/>
-          </w:tcPr>
-          <w:p>
-            <w:pPr>
-              <w:spacing w:after="0" w:line="240" w:lineRule="auto"/>
-              <w:jc w:val="center"/>
-              <w:rPr>
-                <w:sz w:val="20"/>
-                <w:szCs w:val="20"/>
-              </w:rPr>
-            </w:pPr>
-            <w:r>
-              <w:t xml:space="preserve">{powierzchnia}</w:t>
-            </w:r>
-          </w:p>
-        </w:tc>
-        <w:tc>
-          <w:tcPr>
-            <w:tcW w:w="855" w:type="dxa"/>
-            <w:tcBorders>
-              <w:top w:val="single" w:sz="4" w:space="0" w:color="000000"/>
-              <w:left w:val="single" w:sz="4" w:space="0" w:color="000000"/>
-              <w:bottom w:val="single" w:sz="8" w:space="0" w:color="000000"/>
-              <w:right w:val="single" w:sz="4" w:space="0" w:color="000000"/>
-            </w:tcBorders>
-            <w:vAlign w:val="center"/>
-          </w:tcPr>
-          <w:p>
-            <w:pPr>
-              <w:spacing w:after="0" w:line="240" w:lineRule="auto"/>
-              <w:jc w:val="center"/>
-              <w:rPr>
-                <w:sz w:val="20"/>
-                <w:szCs w:val="20"/>
-              </w:rPr>
-            </w:pPr>
-            <w:r>
-              <w:t xml:space="preserve">{kubatura}</w:t>
-            </w:r>
-          </w:p>
-        </w:tc>
-        <w:tc>
-          <w:tcPr>
-            <w:tcW w:w="630" w:type="dxa"/>
-            <w:tcBorders>
-              <w:top w:val="single" w:sz="4" w:space="0" w:color="000000"/>
-              <w:left w:val="single" w:sz="4" w:space="0" w:color="000000"/>
-              <w:bottom w:val="single" w:sz="8" w:space="0" w:color="000000"/>
-              <w:right w:val="single" w:sz="8" w:space="0" w:color="000000"/>
-            </w:tcBorders>
-            <w:vAlign w:val="center"/>
-          </w:tcPr>
-          <w:p>
-            <w:pPr>
-              <w:spacing w:after="0" w:line="240" w:lineRule="auto"/>
-              <w:jc w:val="center"/>
-              <w:rPr>
-                <w:sz w:val="20"/>
-                <w:szCs w:val="20"/>
-              </w:rPr>
-            </w:pPr>
-          </w:p>
-        </w:tc>
-        <w:tc>
-          <w:tcPr>
-            <w:tcW w:w="1215" w:type="dxa"/>
-            <w:tcBorders>
-              <w:top w:val="single" w:sz="4" w:space="0" w:color="000000"/>
-              <w:left w:val="single" w:sz="8" w:space="0" w:color="000000"/>
-              <w:bottom w:val="single" w:sz="8" w:space="0" w:color="000000"/>
-              <w:right w:val="single" w:sz="4" w:space="0" w:color="000000"/>
-            </w:tcBorders>
-            <w:vAlign w:val="bottom"/>
-          </w:tcPr>
-          <w:p>
-            <w:pPr>
-              <w:spacing w:after="0" w:line="240" w:lineRule="auto"/>
-              <w:rPr>
-                <w:sz w:val="20"/>
-                <w:szCs w:val="20"/>
-              </w:rPr>
-            </w:pPr>
-            <w:r>
-              <w:t xml:space="preserve">{dlugosc}</w:t>
-            </w:r>
-          </w:p>
-        </w:tc>
-        <w:tc>
-          <w:tcPr>
-            <w:tcW w:w="915" w:type="dxa"/>
-            <w:tcBorders>
-              <w:top w:val="single" w:sz="4" w:space="0" w:color="000000"/>
-              <w:left w:val="single" w:sz="4" w:space="0" w:color="000000"/>
-              <w:bottom w:val="single" w:sz="8" w:space="0" w:color="000000"/>
-              <w:right w:val="single" w:sz="8" w:space="0" w:color="000000"/>
-            </w:tcBorders>
-            <w:vAlign w:val="bottom"/>
-          </w:tcPr>
-          <w:p>
-            <w:pPr>
-              <w:spacing w:after="0" w:line="240" w:lineRule="auto"/>
-              <w:rPr>
-                <w:sz w:val="20"/>
-                <w:szCs w:val="20"/>
-              </w:rPr>
-            </w:pPr>
-            <w:r>
-              <w:t xml:space="preserve">{szerokosc}</w:t>
-            </w:r>
-          </w:p>
-        </w:tc>
-        <w:tc>
-          <w:tcPr>
-            <w:tcW w:w="1350" w:type="dxa"/>
-            <w:tcBorders>
-              <w:top w:val="single" w:sz="4" w:space="0" w:color="000000"/>
-              <w:left w:val="single" w:sz="8" w:space="0" w:color="000000"/>
-              <w:bottom w:val="single" w:sz="8" w:space="0" w:color="000000"/>
-              <w:right w:val="single" w:sz="8" w:space="0" w:color="000000"/>
-            </w:tcBorders>
-            <w:vAlign w:val="bottom"/>
-          </w:tcPr>
-          <w:p>
-            <w:pPr>
-              <w:spacing w:after="0" w:line="240" w:lineRule="auto"/>
-              <w:rPr>
-                <w:sz w:val="20"/>
-                <w:szCs w:val="20"/>
-              </w:rPr>
-            </w:pPr>
-            <w:r>
-              <w:t xml:space="preserve">{wysokosc}</w:t>
             </w:r>
           </w:p>
         </w:tc>
@@ -5721,6 +5724,9 @@
                 <w:szCs w:val="20"/>
               </w:rPr>
             </w:pPr>
+            <w:r>
+              <w:t xml:space="preserve">{kierujacyNazwisko}</w:t>
+            </w:r>
           </w:p>
         </w:tc>
         <w:tc>
@@ -5742,6 +5748,9 @@
                 <w:szCs w:val="20"/>
               </w:rPr>
             </w:pPr>
+            <w:r>
+              <w:t xml:space="preserve">{kierujacyImie}</w:t>
+            </w:r>
           </w:p>
         </w:tc>
         <w:tc>
@@ -5766,7 +5775,7 @@
               </w:rPr>
             </w:pPr>
             <w:r>
-              <w:t xml:space="preserve">{kierujacyNazwisko}</w:t>
+              <w:t xml:space="preserve">{kierujacyOd}</w:t>
             </w:r>
           </w:p>
         </w:tc>
@@ -5792,7 +5801,7 @@
               </w:rPr>
             </w:pPr>
             <w:r>
-              <w:t xml:space="preserve">{kierujacyImie}</w:t>
+              <w:t xml:space="preserve">{kierujacyDo}</w:t>
             </w:r>
           </w:p>
         </w:tc>
@@ -5818,7 +5827,7 @@
               </w:rPr>
             </w:pPr>
             <w:r>
-              <w:t xml:space="preserve">{kierujacyOd}</w:t>
+              <w:t xml:space="preserve">{kierujacyJednostka}</w:t>
             </w:r>
           </w:p>
         </w:tc>
@@ -5844,7 +5853,11 @@
               </w:rPr>
             </w:pPr>
             <w:r>
-              <w:t xml:space="preserve">{kierujacyDo}</w:t>
+              <w:rPr>
+                <w:sz w:val="20"/>
+                <w:szCs w:val="20"/>
+              </w:rPr>
+              <w:t> </w:t>
             </w:r>
           </w:p>
         </w:tc>
@@ -5892,7 +5905,7 @@
               </w:rPr>
             </w:pPr>
             <w:r>
-              <w:t xml:space="preserve">{kierujacyJednostka}</w:t>
+              <w:t xml:space="preserve">{kierujacy2Nazwisko}</w:t>
             </w:r>
           </w:p>
         </w:tc>
@@ -5916,11 +5929,7 @@
               </w:rPr>
             </w:pPr>
             <w:r>
-              <w:rPr>
-                <w:sz w:val="20"/>
-                <w:szCs w:val="20"/>
-              </w:rPr>
-              <w:t> </w:t>
+              <w:t xml:space="preserve">{kierujacy2Imie}</w:t>
             </w:r>
           </w:p>
         </w:tc>
@@ -5946,11 +5955,7 @@
               </w:rPr>
             </w:pPr>
             <w:r>
-              <w:rPr>
-                <w:sz w:val="20"/>
-                <w:szCs w:val="20"/>
-              </w:rPr>
-              <w:t> </w:t>
+              <w:t xml:space="preserve">{kierujacy2Od}</w:t>
             </w:r>
           </w:p>
         </w:tc>
@@ -5976,11 +5981,7 @@
               </w:rPr>
             </w:pPr>
             <w:r>
-              <w:rPr>
-                <w:sz w:val="20"/>
-                <w:szCs w:val="20"/>
-              </w:rPr>
-              <w:t> </w:t>
+              <w:t xml:space="preserve">{kierujacy2Do}</w:t>
             </w:r>
           </w:p>
         </w:tc>
@@ -6006,11 +6007,7 @@
               </w:rPr>
             </w:pPr>
             <w:r>
-              <w:rPr>
-                <w:sz w:val="20"/>
-                <w:szCs w:val="20"/>
-              </w:rPr>
-              <w:t> </w:t>
+              <w:t xml:space="preserve">{kierujacy2Jednostka}</w:t>
             </w:r>
           </w:p>
         </w:tc>

</xml_diff>